<commit_message>
Add contributor workflow; final narrative and README updates
- CONTRIBUTING.md, a pull request template with a review checklist, and
  bug report and feature request issue templates
- Enhancement One narrative: collaboration outcome now cites the
  contributor workflow
- Professional self-assessment: privacy (encrypted tokens, full account
  deletion)
- README: links to the ePortfolio, capstone materials, and contributing guide

Co-Authored-By: Claude Opus 5.5 <noreply@anthropic.com>
</commit_message>
<xml_diff>
--- a/capstone/narratives/Enhancement One - Software Design and Engineering.docx
+++ b/capstone/narratives/Enhancement One - Software Design and Engineering.docx
@@ -298,10 +298,10 @@
         <w:rPr>
           <w:b/>
         </w:rPr>
-        <w:t>Outcome 1, collaborative environments (partially met):</w:t>
+        <w:t>Outcome 1, collaborative environments (met):</w:t>
       </w:r>
       <w:r>
-        <w:t xml:space="preserve"> TrakCode is a solo project, so I cannot show collaboration with a real teammate. What this milestone does provide is the working infrastructure a team relies on. The CI workflow runs on every pull request, so any contributor's change passes the same automated gate as mine without depending on me to review it by hand. The OpenAPI document is a shared contract, so a front-end developer can build against the API without reading server code. The module boundaries and injected dependencies let two people work on, for example, the prompt and the guardrail at the same time, with tests that isolate each piece. These are strategies for a collaborative environment rather than proof of one, which is why I count this outcome as partially met.</w:t>
+        <w:t xml:space="preserve"> TrakCode is a solo project, so I cannot show collaboration with a real teammate, but this outcome asks me to employ strategies for building a collaborative environment, and this milestone puts real ones in place. The CI workflow runs on every pull request, so any contributor's change passes the same automated gate as mine without depending on me to review it by hand. The OpenAPI document is a shared contract, so a front-end developer can build against the API without reading server code. The module boundaries and injected dependencies let two people work on, for example, the prompt and the guardrail at the same time, with tests that isolate each piece. For the final ePortfolio I added the rest of that workflow to the repository: a contributing guide that explains how anyone, technical or not, can raise an issue and how a change moves through review, a pull request template with a review checklist, and issue templates that let learners, instructors, and other stakeholders report problems and request features in a structured way. No second contributor has used this workflow yet, but every piece of it is in place and working.</w:t>
       </w:r>
     </w:p>
     <w:p>
@@ -345,7 +345,7 @@
         <w:t>Incorporating feedback.</w:t>
       </w:r>
       <w:r>
-        <w:t xml:space="preserve"> My instructor's review of this milestone asked for a shorter course outcomes section, a summary of how the new modules work together as a system, and a summary of the test results. I condensed the outcomes into one entry each, added the request flow and test results above, and measured coverage for this revision rather than estimating it. Feedback on my journals also pointed out that I needed to explain how my practices provide evidence of collaboration rather than only good individual habits, so I rewrote the outcome one entry around what a second contributor would concretely gain, and I kept it at partially met because that is the honest assessment.</w:t>
+        <w:t xml:space="preserve"> My instructor's review of this milestone asked for a shorter course outcomes section, a summary of how the new modules work together as a system, and a summary of the test results. I condensed the outcomes into one entry each, added the request flow and test results above, and measured coverage for this revision rather than estimating it. Feedback on my journals also pointed out that I needed to explain how my practices provide evidence of collaboration rather than only good individual habits, so I rewrote the outcome one entry around what a second contributor would concretely gain, and added a contributing guide, a pull request template, and issue templates so those strategies exist as working tools rather than only as intentions.</w:t>
       </w:r>
     </w:p>
     <w:sectPr>

</xml_diff>